<commit_message>
Add UAE Child Digital Safety Compliance Checklist
</commit_message>
<xml_diff>
--- a/Events/2026/Apr/Deepfakes Harming Girls/Deepfakes Harming Girls Talking Points.docx
+++ b/Events/2026/Apr/Deepfakes Harming Girls/Deepfakes Harming Girls Talking Points.docx
@@ -1181,7 +1181,25 @@
           <w:sz w:val="22"/>
           <w:szCs w:val="22"/>
         </w:rPr>
-        <w:t xml:space="preserve"> Federal Decree-Law No. 34 of 2021 covers the creation and distribution of content that violates personal privacy. You can report to the UAE Cybercrime unit at cybercrime.gov.ae.</w:t>
+        <w:t xml:space="preserve"> Federal Decree-Law No. 34 of 2021 </w:t>
+      </w:r>
+      <w:r>
+        <w:rPr>
+          <w:rFonts w:ascii="Arial" w:eastAsia="Arial" w:hAnsi="Arial" w:cs="Arial"/>
+          <w:color w:val="1D1F21"/>
+          <w:sz w:val="22"/>
+          <w:szCs w:val="22"/>
+        </w:rPr>
+        <w:t xml:space="preserve">on rumours &amp; cybercrimes has strict penalties and </w:t>
+      </w:r>
+      <w:r>
+        <w:rPr>
+          <w:rFonts w:ascii="Arial" w:eastAsia="Arial" w:hAnsi="Arial" w:cs="Arial"/>
+          <w:color w:val="1D1F21"/>
+          <w:sz w:val="22"/>
+          <w:szCs w:val="22"/>
+        </w:rPr>
+        <w:t>covers the creation and distribution of content that violates personal privacy. You can report to the UAE Cybercrime unit at cybercrime.gov.ae.</w:t>
       </w:r>
     </w:p>
     <w:p>
@@ -1867,6 +1885,24 @@
           <w:color w:val="4B5563"/>
         </w:rPr>
         <w:t xml:space="preserve">→ </w:t>
+      </w:r>
+      <w:r>
+        <w:rPr>
+          <w:rFonts w:ascii="Arial" w:eastAsia="Arial" w:hAnsi="Arial" w:cs="Arial"/>
+          <w:b/>
+          <w:bCs/>
+          <w:color w:val="4B5563"/>
+        </w:rPr>
+        <w:t>funded by UK Research and Innovation</w:t>
+      </w:r>
+      <w:r>
+        <w:rPr>
+          <w:rFonts w:ascii="Arial" w:eastAsia="Arial" w:hAnsi="Arial" w:cs="Arial"/>
+          <w:b/>
+          <w:bCs/>
+          <w:color w:val="4B5563"/>
+        </w:rPr>
+        <w:t xml:space="preserve">, </w:t>
       </w:r>
       <w:r>
         <w:rPr>

</xml_diff>